<commit_message>
Appendix A: remove duplicate Decision Rules table (now only in Methodology Table 1)
</commit_message>
<xml_diff>
--- a/thesis/009_Appendices.docx
+++ b/thesis/009_Appendices.docx
@@ -1395,10 +1395,7 @@
         <w:rPr/>
       </w:pPr>
       <w:r>
-        <w:rPr>
-          <w:rtl w:val="0"/>
-        </w:rPr>
-        <w:t xml:space="preserve">Highlight each retained hedge token in the color for its grammatical form. Exclusions are in the Decision Rules table.</w:t>
+        <w:t>Highlight each retained hedge token in the color for its grammatical form. Exclusions follow the Decision Rules for Ambiguous Cases in Methodology (Table 1).</w:t>
       </w:r>
     </w:p>
     <w:tbl>
@@ -2795,33 +2792,6 @@
     </w:p>
     <w:p>
       <w:pPr>
-        <w:keepNext w:val="1"/>
-        <w:spacing w:after="40" w:before="200" w:line="480" w:lineRule="auto"/>
-        <w:ind w:firstLine="0"/>
-        <w:jc w:val="left"/>
-        <w:rPr>
-          <w:sz w:val="24"/>
-          <w:szCs w:val="24"/>
-        </w:rPr>
-      </w:pPr>
-      <w:r>
-        <w:rPr>
-          <w:b w:val="1"/>
-          <w:bCs w:val="1"/>
-          <w:sz w:val="24"/>
-          <w:szCs w:val="24"/>
-          <w:rtl w:val="0"/>
-        </w:rPr>
-        <w:t xml:space="preserve">Decision Rules For Ambiguous Cases</w:t>
-      </w:r>
-      <w:r>
-        <w:rPr>
-          <w:rtl w:val="0"/>
-        </w:rPr>
-      </w:r>
-    </w:p>
-    <w:p>
-      <w:pPr>
         <w:spacing w:after="40" w:before="0" w:line="480" w:lineRule="auto"/>
         <w:ind w:firstLine="0"/>
         <w:jc w:val="left"/>
@@ -2834,780 +2804,6 @@
         <w:t xml:space="preserve">Use the table below for FP reason codes after the claim condition or both tests fail.</w:t>
       </w:r>
     </w:p>
-    <w:tbl>
-      <w:tblPr>
-        <w:tblStyle w:val="Table11"/>
-        <w:tblW w:w="8307.0" w:type="dxa"/>
-        <w:jc w:val="left"/>
-        <w:tblInd w:w="-148.0" w:type="dxa"/>
-        <w:tblLayout w:type="fixed"/>
-        <w:tblLook w:val="0400"/>
-      </w:tblPr>
-      <w:tblGrid>
-        <w:gridCol w:w="2769"/>
-        <w:gridCol w:w="2769"/>
-        <w:gridCol w:w="2769"/>
-        <w:tblGridChange w:id="0">
-          <w:tblGrid>
-            <w:gridCol w:w="2769"/>
-            <w:gridCol w:w="2769"/>
-            <w:gridCol w:w="2769"/>
-          </w:tblGrid>
-        </w:tblGridChange>
-      </w:tblGrid>
-      <w:tr>
-        <w:trPr>
-          <w:cantSplit w:val="1"/>
-          <w:tblHeader w:val="1"/>
-        </w:trPr>
-        <w:tc>
-          <w:tcPr>
-            <w:tcBorders>
-              <w:top w:color="000000" w:space="0" w:sz="18" w:val="single"/>
-              <w:bottom w:color="000000" w:space="0" w:sz="4" w:val="single"/>
-            </w:tcBorders>
-            <w:shd w:fill="f2f4f6" w:val="clear"/>
-          </w:tcPr>
-          <w:p>
-            <w:pPr>
-              <w:spacing w:after="0" w:before="0" w:line="480" w:lineRule="auto"/>
-              <w:jc w:val="both"/>
-              <w:rPr>
-                <w:sz w:val="18"/>
-                <w:szCs w:val="18"/>
-              </w:rPr>
-            </w:pPr>
-            <w:r>
-              <w:rPr>
-                <w:b w:val="1"/>
-                <w:bCs w:val="1"/>
-                <w:sz w:val="18"/>
-                <w:szCs w:val="18"/>
-                <w:rtl w:val="0"/>
-              </w:rPr>
-              <w:t xml:space="preserve">Token</w:t>
-            </w:r>
-            <w:r>
-              <w:rPr>
-                <w:rtl w:val="0"/>
-              </w:rPr>
-            </w:r>
-          </w:p>
-        </w:tc>
-        <w:tc>
-          <w:tcPr>
-            <w:tcBorders>
-              <w:top w:color="000000" w:space="0" w:sz="18" w:val="single"/>
-              <w:bottom w:color="000000" w:space="0" w:sz="4" w:val="single"/>
-            </w:tcBorders>
-            <w:shd w:fill="f2f4f6" w:val="clear"/>
-          </w:tcPr>
-          <w:p>
-            <w:pPr>
-              <w:spacing w:after="0" w:before="0" w:line="480" w:lineRule="auto"/>
-              <w:jc w:val="both"/>
-              <w:rPr>
-                <w:sz w:val="18"/>
-                <w:szCs w:val="18"/>
-              </w:rPr>
-            </w:pPr>
-            <w:r>
-              <w:rPr>
-                <w:b w:val="1"/>
-                <w:bCs w:val="1"/>
-                <w:sz w:val="18"/>
-                <w:szCs w:val="18"/>
-                <w:rtl w:val="0"/>
-              </w:rPr>
-              <w:t xml:space="preserve">Hedge When</w:t>
-            </w:r>
-            <w:r>
-              <w:rPr>
-                <w:rtl w:val="0"/>
-              </w:rPr>
-            </w:r>
-          </w:p>
-        </w:tc>
-        <w:tc>
-          <w:tcPr>
-            <w:tcBorders>
-              <w:top w:color="000000" w:space="0" w:sz="18" w:val="single"/>
-              <w:bottom w:color="000000" w:space="0" w:sz="4" w:val="single"/>
-            </w:tcBorders>
-            <w:shd w:fill="f2f4f6" w:val="clear"/>
-          </w:tcPr>
-          <w:p>
-            <w:pPr>
-              <w:spacing w:after="0" w:before="0" w:line="480" w:lineRule="auto"/>
-              <w:jc w:val="both"/>
-              <w:rPr>
-                <w:sz w:val="18"/>
-                <w:szCs w:val="18"/>
-              </w:rPr>
-            </w:pPr>
-            <w:r>
-              <w:rPr>
-                <w:b w:val="1"/>
-                <w:bCs w:val="1"/>
-                <w:sz w:val="18"/>
-                <w:szCs w:val="18"/>
-                <w:rtl w:val="0"/>
-              </w:rPr>
-              <w:t xml:space="preserve">Not a Hedge When</w:t>
-            </w:r>
-            <w:r>
-              <w:rPr>
-                <w:rtl w:val="0"/>
-              </w:rPr>
-            </w:r>
-          </w:p>
-        </w:tc>
-      </w:tr>
-      <w:tr>
-        <w:trPr>
-          <w:cantSplit w:val="1"/>
-          <w:tblHeader w:val="0"/>
-        </w:trPr>
-        <w:tc>
-          <w:tcPr/>
-          <w:p>
-            <w:pPr>
-              <w:spacing w:after="0" w:before="0" w:line="480" w:lineRule="auto"/>
-              <w:jc w:val="both"/>
-              <w:rPr>
-                <w:sz w:val="18"/>
-                <w:szCs w:val="18"/>
-              </w:rPr>
-            </w:pPr>
-            <w:r>
-              <w:rPr>
-                <w:b w:val="1"/>
-                <w:bCs w:val="1"/>
-                <w:i w:val="0"/>
-                <w:iCs w:val="0"/>
-                <w:color w:val="000000"/>
-                <w:sz w:val="18"/>
-                <w:szCs w:val="18"/>
-                <w:rtl w:val="0"/>
-              </w:rPr>
-              <w:t xml:space="preserve">suggest / indicate</w:t>
-            </w:r>
-            <w:r>
-              <w:rPr>
-                <w:rtl w:val="0"/>
-              </w:rPr>
-            </w:r>
-          </w:p>
-        </w:tc>
-        <w:tc>
-          <w:tcPr/>
-          <w:p>
-            <w:pPr>
-              <w:spacing w:after="0" w:before="0" w:line="480" w:lineRule="auto"/>
-              <w:jc w:val="both"/>
-              <w:rPr>
-                <w:sz w:val="18"/>
-                <w:szCs w:val="18"/>
-              </w:rPr>
-            </w:pPr>
-            <w:r>
-              <w:rPr>
-                <w:sz w:val="18"/>
-                <w:szCs w:val="18"/>
-                <w:rtl w:val="0"/>
-              </w:rPr>
-              <w:t xml:space="preserve">Expresses uncertainty about a finding or conclusion</w:t>
-            </w:r>
-          </w:p>
-        </w:tc>
-        <w:tc>
-          <w:tcPr/>
-          <w:p>
-            <w:pPr>
-              <w:spacing w:after="0" w:before="0" w:line="480" w:lineRule="auto"/>
-              <w:jc w:val="both"/>
-              <w:rPr>
-                <w:sz w:val="18"/>
-                <w:szCs w:val="18"/>
-              </w:rPr>
-            </w:pPr>
-            <w:r>
-              <w:rPr>
-                <w:sz w:val="18"/>
-                <w:szCs w:val="18"/>
-                <w:rtl w:val="0"/>
-              </w:rPr>
-              <w:t xml:space="preserve">Introduces a recommendation or action</w:t>
-            </w:r>
-          </w:p>
-        </w:tc>
-      </w:tr>
-      <w:tr>
-        <w:trPr>
-          <w:cantSplit w:val="1"/>
-          <w:tblHeader w:val="0"/>
-        </w:trPr>
-        <w:tc>
-          <w:tcPr/>
-          <w:p>
-            <w:pPr>
-              <w:spacing w:after="0" w:before="0" w:line="480" w:lineRule="auto"/>
-              <w:jc w:val="both"/>
-              <w:rPr>
-                <w:sz w:val="18"/>
-                <w:szCs w:val="18"/>
-              </w:rPr>
-            </w:pPr>
-            <w:r>
-              <w:rPr>
-                <w:b w:val="1"/>
-                <w:bCs w:val="1"/>
-                <w:i w:val="0"/>
-                <w:iCs w:val="0"/>
-                <w:color w:val="000000"/>
-                <w:sz w:val="18"/>
-                <w:szCs w:val="18"/>
-                <w:rtl w:val="0"/>
-              </w:rPr>
-              <w:t xml:space="preserve">suggest / indicate + need for</w:t>
-            </w:r>
-            <w:r>
-              <w:rPr>
-                <w:rtl w:val="0"/>
-              </w:rPr>
-            </w:r>
-          </w:p>
-        </w:tc>
-        <w:tc>
-          <w:tcPr/>
-          <w:p>
-            <w:pPr>
-              <w:spacing w:after="0" w:before="0" w:line="480" w:lineRule="auto"/>
-              <w:jc w:val="both"/>
-              <w:rPr>
-                <w:sz w:val="18"/>
-                <w:szCs w:val="18"/>
-              </w:rPr>
-            </w:pPr>
-            <w:r>
-              <w:rPr>
-                <w:sz w:val="18"/>
-                <w:szCs w:val="18"/>
-                <w:rtl w:val="0"/>
-              </w:rPr>
-              <w:t xml:space="preserve">Says the evidence suggests a need may exist</w:t>
-            </w:r>
-          </w:p>
-        </w:tc>
-        <w:tc>
-          <w:tcPr/>
-          <w:p>
-            <w:pPr>
-              <w:spacing w:after="0" w:before="0" w:line="480" w:lineRule="auto"/>
-              <w:jc w:val="both"/>
-              <w:rPr>
-                <w:sz w:val="18"/>
-                <w:szCs w:val="18"/>
-              </w:rPr>
-            </w:pPr>
-            <w:r>
-              <w:rPr>
-                <w:sz w:val="18"/>
-                <w:szCs w:val="18"/>
-                <w:rtl w:val="0"/>
-              </w:rPr>
-              <w:t xml:space="preserve">Says what should be done or is needed</w:t>
-            </w:r>
-          </w:p>
-        </w:tc>
-      </w:tr>
-      <w:tr>
-        <w:trPr>
-          <w:cantSplit w:val="1"/>
-          <w:tblHeader w:val="0"/>
-        </w:trPr>
-        <w:tc>
-          <w:tcPr/>
-          <w:p>
-            <w:pPr>
-              <w:spacing w:after="0" w:before="0" w:line="480" w:lineRule="auto"/>
-              <w:jc w:val="both"/>
-              <w:rPr>
-                <w:sz w:val="18"/>
-                <w:szCs w:val="18"/>
-              </w:rPr>
-            </w:pPr>
-            <w:r>
-              <w:rPr>
-                <w:b w:val="1"/>
-                <w:bCs w:val="1"/>
-                <w:i w:val="0"/>
-                <w:iCs w:val="0"/>
-                <w:color w:val="000000"/>
-                <w:sz w:val="18"/>
-                <w:szCs w:val="18"/>
-                <w:rtl w:val="0"/>
-              </w:rPr>
-              <w:t xml:space="preserve">indicated by</w:t>
-            </w:r>
-            <w:r>
-              <w:rPr>
-                <w:rtl w:val="0"/>
-              </w:rPr>
-            </w:r>
-          </w:p>
-        </w:tc>
-        <w:tc>
-          <w:tcPr/>
-          <w:p>
-            <w:pPr>
-              <w:spacing w:after="0" w:before="0" w:line="480" w:lineRule="auto"/>
-              <w:jc w:val="both"/>
-              <w:rPr>
-                <w:sz w:val="18"/>
-                <w:szCs w:val="18"/>
-              </w:rPr>
-            </w:pPr>
-            <w:r>
-              <w:rPr>
-                <w:sz w:val="18"/>
-                <w:szCs w:val="18"/>
-                <w:rtl w:val="0"/>
-              </w:rPr>
-              <w:t xml:space="preserve">Introduces a conclusion drawn from evidence</w:t>
-            </w:r>
-          </w:p>
-        </w:tc>
-        <w:tc>
-          <w:tcPr/>
-          <w:p>
-            <w:pPr>
-              <w:spacing w:after="0" w:before="0" w:line="480" w:lineRule="auto"/>
-              <w:jc w:val="both"/>
-              <w:rPr>
-                <w:sz w:val="18"/>
-                <w:szCs w:val="18"/>
-              </w:rPr>
-            </w:pPr>
-            <w:r>
-              <w:rPr>
-                <w:sz w:val="18"/>
-                <w:szCs w:val="18"/>
-                <w:rtl w:val="0"/>
-              </w:rPr>
-              <w:t xml:space="preserve">Points to evidence for a claim already stated</w:t>
-            </w:r>
-          </w:p>
-        </w:tc>
-      </w:tr>
-      <w:tr>
-        <w:trPr>
-          <w:cantSplit w:val="1"/>
-          <w:tblHeader w:val="0"/>
-        </w:trPr>
-        <w:tc>
-          <w:tcPr/>
-          <w:p>
-            <w:pPr>
-              <w:spacing w:after="0" w:before="0" w:line="480" w:lineRule="auto"/>
-              <w:jc w:val="both"/>
-              <w:rPr>
-                <w:sz w:val="18"/>
-                <w:szCs w:val="18"/>
-              </w:rPr>
-            </w:pPr>
-            <w:r>
-              <w:rPr>
-                <w:b w:val="1"/>
-                <w:bCs w:val="1"/>
-                <w:i w:val="0"/>
-                <w:iCs w:val="0"/>
-                <w:color w:val="000000"/>
-                <w:sz w:val="18"/>
-                <w:szCs w:val="18"/>
-                <w:rtl w:val="0"/>
-              </w:rPr>
-              <w:t xml:space="preserve">indicate / indicates that</w:t>
-            </w:r>
-            <w:r>
-              <w:rPr>
-                <w:rtl w:val="0"/>
-              </w:rPr>
-            </w:r>
-          </w:p>
-        </w:tc>
-        <w:tc>
-          <w:tcPr/>
-          <w:p>
-            <w:pPr>
-              <w:spacing w:after="0" w:before="0" w:line="480" w:lineRule="auto"/>
-              <w:jc w:val="both"/>
-              <w:rPr>
-                <w:sz w:val="18"/>
-                <w:szCs w:val="18"/>
-              </w:rPr>
-            </w:pPr>
-            <w:r>
-              <w:rPr>
-                <w:sz w:val="18"/>
-                <w:szCs w:val="18"/>
-                <w:rtl w:val="0"/>
-              </w:rPr>
-              <w:t xml:space="preserve">Introduces an inferential conclusion drawn from analysis</w:t>
-            </w:r>
-          </w:p>
-        </w:tc>
-        <w:tc>
-          <w:tcPr/>
-          <w:p>
-            <w:pPr>
-              <w:spacing w:after="0" w:before="0" w:line="480" w:lineRule="auto"/>
-              <w:jc w:val="both"/>
-              <w:rPr>
-                <w:sz w:val="18"/>
-                <w:szCs w:val="18"/>
-              </w:rPr>
-            </w:pPr>
-            <w:r>
-              <w:rPr>
-                <w:sz w:val="18"/>
-                <w:szCs w:val="18"/>
-                <w:rtl w:val="0"/>
-              </w:rPr>
-              <w:t xml:space="preserve">Used as a synonym for showed/demonstrated (factive reporting)</w:t>
-            </w:r>
-          </w:p>
-        </w:tc>
-      </w:tr>
-      <w:tr>
-        <w:trPr>
-          <w:cantSplit w:val="1"/>
-          <w:tblHeader w:val="0"/>
-        </w:trPr>
-        <w:tc>
-          <w:tcPr/>
-          <w:p>
-            <w:pPr>
-              <w:spacing w:after="0" w:before="0" w:line="480" w:lineRule="auto"/>
-              <w:jc w:val="both"/>
-              <w:rPr>
-                <w:sz w:val="18"/>
-                <w:szCs w:val="18"/>
-              </w:rPr>
-            </w:pPr>
-            <w:r>
-              <w:rPr>
-                <w:b w:val="1"/>
-                <w:bCs w:val="1"/>
-                <w:i w:val="0"/>
-                <w:iCs w:val="0"/>
-                <w:color w:val="000000"/>
-                <w:sz w:val="18"/>
-                <w:szCs w:val="18"/>
-                <w:rtl w:val="0"/>
-              </w:rPr>
-              <w:t xml:space="preserve">indicating (participial)</w:t>
-            </w:r>
-            <w:r>
-              <w:rPr>
-                <w:rtl w:val="0"/>
-              </w:rPr>
-            </w:r>
-          </w:p>
-        </w:tc>
-        <w:tc>
-          <w:tcPr/>
-          <w:p>
-            <w:pPr>
-              <w:spacing w:after="0" w:before="0" w:line="480" w:lineRule="auto"/>
-              <w:jc w:val="both"/>
-              <w:rPr>
-                <w:sz w:val="18"/>
-                <w:szCs w:val="18"/>
-              </w:rPr>
-            </w:pPr>
-            <w:r>
-              <w:rPr>
-                <w:sz w:val="18"/>
-                <w:szCs w:val="18"/>
-                <w:rtl w:val="0"/>
-              </w:rPr>
-              <w:t xml:space="preserve">Introduces an inference beyond the operational definition of the result</w:t>
-            </w:r>
-          </w:p>
-        </w:tc>
-        <w:tc>
-          <w:tcPr/>
-          <w:p>
-            <w:pPr>
-              <w:spacing w:after="0" w:before="0" w:line="480" w:lineRule="auto"/>
-              <w:jc w:val="both"/>
-              <w:rPr>
-                <w:sz w:val="18"/>
-                <w:szCs w:val="18"/>
-              </w:rPr>
-            </w:pPr>
-            <w:r>
-              <w:rPr>
-                <w:sz w:val="18"/>
-                <w:szCs w:val="18"/>
-                <w:rtl w:val="0"/>
-              </w:rPr>
-              <w:t xml:space="preserve">Restates the operational meaning of statistical significance</w:t>
-            </w:r>
-          </w:p>
-        </w:tc>
-      </w:tr>
-      <w:tr>
-        <w:trPr>
-          <w:cantSplit w:val="1"/>
-          <w:tblHeader w:val="0"/>
-        </w:trPr>
-        <w:tc>
-          <w:tcPr/>
-          <w:p>
-            <w:pPr>
-              <w:spacing w:after="0" w:before="0" w:line="480" w:lineRule="auto"/>
-              <w:jc w:val="both"/>
-              <w:rPr>
-                <w:sz w:val="18"/>
-                <w:szCs w:val="18"/>
-              </w:rPr>
-            </w:pPr>
-            <w:r>
-              <w:rPr>
-                <w:b w:val="1"/>
-                <w:bCs w:val="1"/>
-                <w:i w:val="0"/>
-                <w:iCs w:val="0"/>
-                <w:color w:val="000000"/>
-                <w:sz w:val="18"/>
-                <w:szCs w:val="18"/>
-                <w:rtl w:val="0"/>
-              </w:rPr>
-              <w:t xml:space="preserve">can / may</w:t>
-            </w:r>
-            <w:r>
-              <w:rPr>
-                <w:rtl w:val="0"/>
-              </w:rPr>
-            </w:r>
-          </w:p>
-        </w:tc>
-        <w:tc>
-          <w:tcPr/>
-          <w:p>
-            <w:pPr>
-              <w:spacing w:after="0" w:before="0" w:line="480" w:lineRule="auto"/>
-              <w:jc w:val="both"/>
-              <w:rPr>
-                <w:sz w:val="18"/>
-                <w:szCs w:val="18"/>
-              </w:rPr>
-            </w:pPr>
-            <w:r>
-              <w:rPr>
-                <w:sz w:val="18"/>
-                <w:szCs w:val="18"/>
-                <w:rtl w:val="0"/>
-              </w:rPr>
-              <w:t xml:space="preserve">Expresses possibility</w:t>
-            </w:r>
-          </w:p>
-        </w:tc>
-        <w:tc>
-          <w:tcPr/>
-          <w:p>
-            <w:pPr>
-              <w:spacing w:after="0" w:before="0" w:line="480" w:lineRule="auto"/>
-              <w:jc w:val="both"/>
-              <w:rPr>
-                <w:sz w:val="18"/>
-                <w:szCs w:val="18"/>
-              </w:rPr>
-            </w:pPr>
-            <w:r>
-              <w:rPr>
-                <w:sz w:val="18"/>
-                <w:szCs w:val="18"/>
-                <w:rtl w:val="0"/>
-              </w:rPr>
-              <w:t xml:space="preserve">Expresses capability</w:t>
-            </w:r>
-          </w:p>
-        </w:tc>
-      </w:tr>
-      <w:tr>
-        <w:trPr>
-          <w:cantSplit w:val="1"/>
-          <w:tblHeader w:val="0"/>
-        </w:trPr>
-        <w:tc>
-          <w:tcPr/>
-          <w:p>
-            <w:pPr>
-              <w:spacing w:after="0" w:before="0" w:line="480" w:lineRule="auto"/>
-              <w:jc w:val="both"/>
-              <w:rPr>
-                <w:sz w:val="18"/>
-                <w:szCs w:val="18"/>
-              </w:rPr>
-            </w:pPr>
-            <w:r>
-              <w:rPr>
-                <w:b w:val="1"/>
-                <w:bCs w:val="1"/>
-                <w:i w:val="0"/>
-                <w:iCs w:val="0"/>
-                <w:color w:val="000000"/>
-                <w:sz w:val="18"/>
-                <w:szCs w:val="18"/>
-                <w:rtl w:val="0"/>
-              </w:rPr>
-              <w:t xml:space="preserve">generally / typically</w:t>
-            </w:r>
-            <w:r>
-              <w:rPr>
-                <w:rtl w:val="0"/>
-              </w:rPr>
-            </w:r>
-          </w:p>
-        </w:tc>
-        <w:tc>
-          <w:tcPr/>
-          <w:p>
-            <w:pPr>
-              <w:spacing w:after="0" w:before="0" w:line="480" w:lineRule="auto"/>
-              <w:jc w:val="both"/>
-              <w:rPr>
-                <w:sz w:val="18"/>
-                <w:szCs w:val="18"/>
-              </w:rPr>
-            </w:pPr>
-            <w:r>
-              <w:rPr>
-                <w:sz w:val="18"/>
-                <w:szCs w:val="18"/>
-                <w:rtl w:val="0"/>
-              </w:rPr>
-              <w:t xml:space="preserve">Qualifies scope</w:t>
-            </w:r>
-          </w:p>
-        </w:tc>
-        <w:tc>
-          <w:tcPr/>
-          <w:p>
-            <w:pPr>
-              <w:spacing w:after="0" w:before="0" w:line="480" w:lineRule="auto"/>
-              <w:jc w:val="both"/>
-              <w:rPr>
-                <w:sz w:val="18"/>
-                <w:szCs w:val="18"/>
-              </w:rPr>
-            </w:pPr>
-            <w:r>
-              <w:rPr>
-                <w:sz w:val="18"/>
-                <w:szCs w:val="18"/>
-                <w:rtl w:val="0"/>
-              </w:rPr>
-              <w:t xml:space="preserve">Describes a procedural norm</w:t>
-            </w:r>
-          </w:p>
-        </w:tc>
-      </w:tr>
-      <w:tr>
-        <w:trPr>
-          <w:cantSplit w:val="1"/>
-          <w:tblHeader w:val="0"/>
-        </w:trPr>
-        <w:tc>
-          <w:tcPr>
-            <w:tcBorders>
-              <w:bottom w:color="000000" w:space="0" w:sz="18" w:val="single"/>
-            </w:tcBorders>
-          </w:tcPr>
-          <w:p>
-            <w:pPr>
-              <w:spacing w:after="0" w:before="0" w:line="480" w:lineRule="auto"/>
-              <w:jc w:val="both"/>
-              <w:rPr>
-                <w:sz w:val="18"/>
-                <w:szCs w:val="18"/>
-              </w:rPr>
-            </w:pPr>
-            <w:r>
-              <w:rPr>
-                <w:b w:val="1"/>
-                <w:bCs w:val="1"/>
-                <w:i w:val="0"/>
-                <w:iCs w:val="0"/>
-                <w:color w:val="000000"/>
-                <w:sz w:val="18"/>
-                <w:szCs w:val="18"/>
-                <w:rtl w:val="0"/>
-              </w:rPr>
-              <w:t xml:space="preserve">appear / seem</w:t>
-            </w:r>
-            <w:r>
-              <w:rPr>
-                <w:rtl w:val="0"/>
-              </w:rPr>
-            </w:r>
-          </w:p>
-        </w:tc>
-        <w:tc>
-          <w:tcPr>
-            <w:tcBorders>
-              <w:bottom w:color="000000" w:space="0" w:sz="18" w:val="single"/>
-            </w:tcBorders>
-          </w:tcPr>
-          <w:p>
-            <w:pPr>
-              <w:spacing w:after="0" w:before="0" w:line="480" w:lineRule="auto"/>
-              <w:jc w:val="both"/>
-              <w:rPr>
-                <w:sz w:val="18"/>
-                <w:szCs w:val="18"/>
-              </w:rPr>
-            </w:pPr>
-            <w:r>
-              <w:rPr>
-                <w:sz w:val="18"/>
-                <w:szCs w:val="18"/>
-                <w:rtl w:val="0"/>
-              </w:rPr>
-              <w:t xml:space="preserve">Expresses result uncertainty</w:t>
-            </w:r>
-          </w:p>
-        </w:tc>
-        <w:tc>
-          <w:tcPr>
-            <w:tcBorders>
-              <w:bottom w:color="000000" w:space="0" w:sz="18" w:val="single"/>
-            </w:tcBorders>
-          </w:tcPr>
-          <w:p>
-            <w:pPr>
-              <w:spacing w:after="0" w:before="0" w:line="480" w:lineRule="auto"/>
-              <w:jc w:val="both"/>
-              <w:rPr>
-                <w:sz w:val="18"/>
-                <w:szCs w:val="18"/>
-              </w:rPr>
-            </w:pPr>
-            <w:r>
-              <w:rPr>
-                <w:sz w:val="18"/>
-                <w:szCs w:val="18"/>
-                <w:rtl w:val="0"/>
-              </w:rPr>
-              <w:t xml:space="preserve">Indicates location</w:t>
-            </w:r>
-          </w:p>
-        </w:tc>
-      </w:tr>
-    </w:tbl>
     <w:p>
       <w:pPr>
         <w:spacing w:after="40" w:before="0" w:line="480" w:lineRule="auto"/>

</xml_diff>